<commit_message>
Update resume content and location
</commit_message>
<xml_diff>
--- a/assets/Rahul_Raj_Resume.docx
+++ b/assets/Rahul_Raj_Resume.docx
@@ -38,7 +38,7 @@
           <w:color w:val="444444"/>
           <w:sz w:val="19"/>
         </w:rPr>
-        <w:t xml:space="preserve">Chennai, Tamil Nadu, India | +91 96296 36733 | </w:t>
+        <w:t xml:space="preserve">Bangalore, Karnataka, India | +91 96296 36733 | </w:t>
       </w:r>
       <w:hyperlink r:id="rId9">
         <w:r>
@@ -111,7 +111,7 @@
           <w:color w:val="000000"/>
           <w:sz w:val="20"/>
         </w:rPr>
-        <w:t>Identity and security analyst with nearly four years of experience in identity and access management, access governance, OT security monitoring, and security automation. Promoted from IAM Trainee to Associate Analyst at CDW. Work spans SailPoint IdentityIQ, Active Directory, Okta, Microsoft Exchange, ServiceNow, and Claroty. Created internal web and PowerShell tools that shortened monthly IAM audit reporting from roughly three to four days to a few hours and reduced employee transfer-case preparation from about 45 minutes to five minutes. Applying this operational security background to Generative AI, retrieval-augmented generation (RAG), and agentic AI portfolio projects built with Python and Streamlit, deterministic controls, prompt-injection safeguards, structured outputs, and human approval.</w:t>
+        <w:t>Identity and security analyst with nearly four years of experience in identity and access management, access governance, OT security monitoring, and security automation. Promoted from IAM Trainee to Associate Analyst at CDW. Work spans SailPoint IdentityIQ, Active Directory, Okta, Microsoft Exchange, ServiceNow, and Claroty. Created internal web and PowerShell tools that shortened monthly IAM audit reporting from roughly three to four days to a few hours and reduced employee transfer-case preparation from about 45 minutes to five minutes. Applying this operational security background to secure Generative AI, retrieval-augmented generation (RAG), and agentic AI portfolio projects built with Python and Streamlit, output validation, prompt-injection safeguards, and human approval.</w:t>
       </w:r>
     </w:p>
     <w:p>
@@ -191,7 +191,7 @@
           <w:color w:val="000000"/>
           <w:sz w:val="19"/>
         </w:rPr>
-        <w:t>Python, PowerShell, Streamlit, Pydantic, Microsoft 365, Exchange Online, on-premises Exchange, Excel reporting, Git, Docker, Linux, and VS Code</w:t>
+        <w:t>Python, Streamlit, PowerShell, Pydantic, Microsoft 365, Exchange Online, on-premises Exchange, Excel reporting, Git, Docker, Linux, and VS Code</w:t>
       </w:r>
     </w:p>
     <w:p>
@@ -215,7 +215,7 @@
           <w:color w:val="000000"/>
           <w:sz w:val="19"/>
         </w:rPr>
-        <w:t>Generative AI, local TF-IDF retrieval-augmented generation (RAG), agentic AI concepts, structured LLM outputs, prompt-injection defenses, deterministic guardrails, human-in-the-loop review, privacy-aware audit logging, and AI-assisted development with Codex and Claude Code</w:t>
+        <w:t>Generative AI, retrieval-augmented generation (RAG), agentic AI concepts, LLM output validation, prompt-injection safeguards, deterministic controls, human-in-the-loop review, secure audit logging, and AI-assisted development with Codex and Claude Code</w:t>
       </w:r>
     </w:p>
     <w:p>
@@ -246,7 +246,7 @@
         <w:keepNext/>
       </w:pPr>
       <w:r>
-        <w:t>Chennai, Tamil Nadu, India</w:t>
+        <w:t>Bangalore, Karnataka, India</w:t>
       </w:r>
     </w:p>
     <w:p>
@@ -384,7 +384,7 @@
         <w:keepNext/>
       </w:pPr>
       <w:r>
-        <w:t>Chennai, Tamil Nadu, India</w:t>
+        <w:t>Bangalore, Karnataka, India</w:t>
       </w:r>
     </w:p>
     <w:p>
@@ -685,7 +685,7 @@
         <w:pStyle w:val="Heading1"/>
       </w:pPr>
       <w:r>
-        <w:t>Personal AI Security Projects</w:t>
+        <w:t>Personal AI and Security Projects</w:t>
       </w:r>
     </w:p>
     <w:p>
@@ -714,7 +714,7 @@
         <w:keepNext/>
       </w:pPr>
       <w:r>
-        <w:t>Python | Streamlit | Pydantic | Local TF-IDF RAG | Docker</w:t>
+        <w:t>Python | Streamlit | RAG | AI Security | Docker</w:t>
       </w:r>
     </w:p>
     <w:p>
@@ -737,7 +737,7 @@
           <w:color w:val="000000"/>
           <w:sz w:val="19"/>
         </w:rPr>
-        <w:t>Developed a local-first access-review prototype for synthetic SailPoint-style identity and entitlement data, with deterministic checks for least privilege, stale access, lifecycle status, privileged access, and segregation of duties.</w:t>
+        <w:t>Built a portfolio web app using synthetic SailPoint-style data to flag stale, privileged, lifecycle, and segregation-of-duties risks and prepare manager review reports.</w:t>
       </w:r>
     </w:p>
     <w:p>
@@ -760,30 +760,7 @@
           <w:color w:val="000000"/>
           <w:sz w:val="19"/>
         </w:rPr>
-        <w:t>Kept authorization decisions outside the LLM path while adding local policy retrieval, prompt-injection quarantine, validated outputs, manager email and report exports, and privacy-aware audit events.</w:t>
-      </w:r>
-    </w:p>
-    <w:p>
-      <w:pPr>
-        <w:pStyle w:val="ResumeBullet"/>
-      </w:pPr>
-      <w:r>
-        <w:rPr>
-          <w:rFonts w:ascii="Arial" w:hAnsi="Arial"/>
-          <w:b w:val="0"/>
-          <w:color w:val="000000"/>
-          <w:sz w:val="19"/>
-        </w:rPr>
-        <w:t xml:space="preserve">• </w:t>
-      </w:r>
-      <w:r>
-        <w:rPr>
-          <w:rFonts w:ascii="Arial" w:hAnsi="Arial"/>
-          <w:b w:val="0"/>
-          <w:color w:val="000000"/>
-          <w:sz w:val="19"/>
-        </w:rPr>
-        <w:t>Confirmed the workflow with 11 automated tests and four of four adversarial prompt-injection evaluations. The prototype has no production connector and cannot approve, revoke, or modify access.</w:t>
+        <w:t>Added RAG for policy lookup, prompt-injection checks, validated outputs, human review, and 11 automated tests. The prototype has no production connector and cannot change access.</w:t>
       </w:r>
     </w:p>
     <w:p>
@@ -812,7 +789,7 @@
         <w:keepNext/>
       </w:pPr>
       <w:r>
-        <w:t>Python | Streamlit | CLI | Local TF-IDF RAG | JSONL Audit Logging</w:t>
+        <w:t>Python | Streamlit | RAG | OT Security | Audit Logging</w:t>
       </w:r>
     </w:p>
     <w:p>
@@ -835,7 +812,7 @@
           <w:color w:val="000000"/>
           <w:sz w:val="19"/>
         </w:rPr>
-        <w:t>Developed an OT alert-triage prototype that turns synthetic, vendor-neutral alerts into explainable risk assessments, cited runbook evidence, response plans, and analyst escalation drafts.</w:t>
+        <w:t>Built a portfolio tool that turns synthetic OT alerts into explainable risk summaries, runbook-backed response plans, and analyst escalation drafts.</w:t>
       </w:r>
     </w:p>
     <w:p>
@@ -858,30 +835,7 @@
           <w:color w:val="000000"/>
           <w:sz w:val="19"/>
         </w:rPr>
-        <w:t>Restricted model use with deterministic scoring, full-alert prompt-injection inspection, unsafe-action filtering, HTTPS endpoint allowlisting, fallback behavior, and human approval boundaries; the tool performs no autonomous remediation.</w:t>
-      </w:r>
-    </w:p>
-    <w:p>
-      <w:pPr>
-        <w:pStyle w:val="ResumeBullet"/>
-      </w:pPr>
-      <w:r>
-        <w:rPr>
-          <w:rFonts w:ascii="Arial" w:hAnsi="Arial"/>
-          <w:b w:val="0"/>
-          <w:color w:val="000000"/>
-          <w:sz w:val="19"/>
-        </w:rPr>
-        <w:t xml:space="preserve">• </w:t>
-      </w:r>
-      <w:r>
-        <w:rPr>
-          <w:rFonts w:ascii="Arial" w:hAnsi="Arial"/>
-          <w:b w:val="0"/>
-          <w:color w:val="000000"/>
-          <w:sz w:val="19"/>
-        </w:rPr>
-        <w:t>Tested input validation, retrieval, scoring, safeguards, audit behavior, and fallback handling with 23 automated tests across five synthetic scenarios.</w:t>
+        <w:t>Added RAG, rule-based scoring, safety filters, audit logging, human approval, and 23 automated tests across five scenarios. The prototype performs no autonomous remediation.</w:t>
       </w:r>
     </w:p>
     <w:sectPr>

</xml_diff>

<commit_message>
Simplify AI positioning and refresh resume
</commit_message>
<xml_diff>
--- a/assets/Rahul_Raj_Resume.docx
+++ b/assets/Rahul_Raj_Resume.docx
@@ -21,9 +21,9 @@
           <w:rFonts w:ascii="Arial" w:hAnsi="Arial"/>
           <w:b/>
           <w:color w:val="000000"/>
-          <w:sz w:val="21"/>
+          <w:sz w:val="22"/>
         </w:rPr>
-        <w:t>IAM and OT Security Analyst | AI Security and Automation</w:t>
+        <w:t>Identity and Security Analyst | IAM, OT Security and Automation</w:t>
       </w:r>
     </w:p>
     <w:p>
@@ -46,7 +46,7 @@
             <w:color w:val="444444"/>
             <w:u w:val="none"/>
             <w:rFonts w:ascii="Arial" w:hAnsi="Arial"/>
-            <w:sz w:val="19"/>
+            <w:sz w:val="20"/>
           </w:rPr>
           <w:t>vcrahulraj@gmail.com</w:t>
         </w:r>
@@ -66,29 +66,9 @@
             <w:color w:val="444444"/>
             <w:u w:val="none"/>
             <w:rFonts w:ascii="Arial" w:hAnsi="Arial"/>
-            <w:sz w:val="19"/>
+            <w:sz w:val="20"/>
           </w:rPr>
           <w:t>github.com/vcrahulraj</w:t>
-        </w:r>
-      </w:hyperlink>
-      <w:r>
-        <w:rPr>
-          <w:rFonts w:ascii="Arial" w:hAnsi="Arial"/>
-          <w:b w:val="0"/>
-          <w:color w:val="444444"/>
-          <w:sz w:val="19"/>
-        </w:rPr>
-        <w:t xml:space="preserve"> | </w:t>
-      </w:r>
-      <w:hyperlink r:id="rId11">
-        <w:r>
-          <w:rPr>
-            <w:color w:val="444444"/>
-            <w:u w:val="none"/>
-            <w:rFonts w:ascii="Arial" w:hAnsi="Arial"/>
-            <w:sz w:val="19"/>
-          </w:rPr>
-          <w:t>vcrahulraj.github.io</w:t>
         </w:r>
       </w:hyperlink>
     </w:p>
@@ -109,9 +89,9 @@
           <w:rFonts w:ascii="Arial" w:hAnsi="Arial"/>
           <w:b w:val="0"/>
           <w:color w:val="000000"/>
-          <w:sz w:val="20"/>
+          <w:sz w:val="21"/>
         </w:rPr>
-        <w:t>Identity and security analyst with nearly four years of experience in identity and access management, access governance, OT security monitoring, and security automation. Promoted from IAM Trainee to Associate Analyst at CDW. Work spans SailPoint IdentityIQ, Active Directory, Okta, Microsoft Exchange, ServiceNow, and Claroty. Created internal web and PowerShell tools that shortened monthly IAM audit reporting from roughly three to four days to a few hours and reduced employee transfer-case preparation from about 45 minutes to five minutes. Applying this operational security background to secure Generative AI, retrieval-augmented generation (RAG), and agentic AI portfolio projects built with Python and Streamlit, output validation, prompt-injection safeguards, and human approval.</w:t>
+        <w:t>Identity and security analyst with nearly four years of experience in identity and access management, access governance, OT security monitoring, and security automation. Promoted from IAM Trainee to Associate Analyst at CDW. Work spans SailPoint IdentityIQ, Active Directory, Okta, Microsoft Exchange, ServiceNow, and Claroty. Created internal web and PowerShell tools that shortened monthly IAM audit reporting from roughly three to four days to a few hours and reduced employee transfer-case preparation from about 45 minutes to five minutes. Now strengthening AI-assisted development and automation skills while seeking opportunities to grow into AI engineering, AI security, and intelligent automation roles.</w:t>
       </w:r>
     </w:p>
     <w:p>
@@ -132,7 +112,7 @@
           <w:rFonts w:ascii="Arial" w:hAnsi="Arial"/>
           <w:b/>
           <w:color w:val="000000"/>
-          <w:sz w:val="19"/>
+          <w:sz w:val="20"/>
         </w:rPr>
         <w:t xml:space="preserve">Identity and Access Management: </w:t>
       </w:r>
@@ -141,7 +121,7 @@
           <w:rFonts w:ascii="Arial" w:hAnsi="Arial"/>
           <w:b w:val="0"/>
           <w:color w:val="000000"/>
-          <w:sz w:val="19"/>
+          <w:sz w:val="20"/>
         </w:rPr>
         <w:t>SailPoint IdentityIQ, identity lifecycle operations, joiner-mover-leaver workflows, entitlement reviews, access governance, Active Directory, Okta, ServiceNow, distribution lists, security groups, and service accounts</w:t>
       </w:r>
@@ -156,7 +136,7 @@
           <w:rFonts w:ascii="Arial" w:hAnsi="Arial"/>
           <w:b/>
           <w:color w:val="000000"/>
-          <w:sz w:val="19"/>
+          <w:sz w:val="20"/>
         </w:rPr>
         <w:t xml:space="preserve">OT and Security Operations: </w:t>
       </w:r>
@@ -165,7 +145,7 @@
           <w:rFonts w:ascii="Arial" w:hAnsi="Arial"/>
           <w:b w:val="0"/>
           <w:color w:val="000000"/>
-          <w:sz w:val="19"/>
+          <w:sz w:val="20"/>
         </w:rPr>
         <w:t>Claroty monitoring, vulnerability and alert triage, asset and service availability, connectivity monitoring, degraded network traffic analysis, escalation, and IBM QRadar SIEM</w:t>
       </w:r>
@@ -180,7 +160,7 @@
           <w:rFonts w:ascii="Arial" w:hAnsi="Arial"/>
           <w:b/>
           <w:color w:val="000000"/>
-          <w:sz w:val="19"/>
+          <w:sz w:val="20"/>
         </w:rPr>
         <w:t xml:space="preserve">Automation and Administration: </w:t>
       </w:r>
@@ -189,9 +169,9 @@
           <w:rFonts w:ascii="Arial" w:hAnsi="Arial"/>
           <w:b w:val="0"/>
           <w:color w:val="000000"/>
-          <w:sz w:val="19"/>
+          <w:sz w:val="20"/>
         </w:rPr>
-        <w:t>Python, Streamlit, PowerShell, Pydantic, Microsoft 365, Exchange Online, on-premises Exchange, Excel reporting, Git, Docker, Linux, and VS Code</w:t>
+        <w:t>PowerShell, Microsoft 365, Exchange Online, on-premises Exchange, Excel reporting, ServiceNow, Git, Linux, and VS Code</w:t>
       </w:r>
     </w:p>
     <w:p>
@@ -204,18 +184,18 @@
           <w:rFonts w:ascii="Arial" w:hAnsi="Arial"/>
           <w:b/>
           <w:color w:val="000000"/>
-          <w:sz w:val="19"/>
+          <w:sz w:val="20"/>
         </w:rPr>
-        <w:t xml:space="preserve">Secure AI Engineering: </w:t>
+        <w:t xml:space="preserve">AI-Assisted Development: </w:t>
       </w:r>
       <w:r>
         <w:rPr>
           <w:rFonts w:ascii="Arial" w:hAnsi="Arial"/>
           <w:b w:val="0"/>
           <w:color w:val="000000"/>
-          <w:sz w:val="19"/>
+          <w:sz w:val="20"/>
         </w:rPr>
-        <w:t>Generative AI, retrieval-augmented generation (RAG), agentic AI concepts, LLM output validation, prompt-injection safeguards, deterministic controls, human-in-the-loop review, secure audit logging, and AI-assisted development with Codex and Claude Code</w:t>
+        <w:t>Codex, Claude Code, Python-based web application prototyping, prompt-led development, output review, functional testing, documentation, and human approval</w:t>
       </w:r>
     </w:p>
     <w:p>
@@ -258,7 +238,7 @@
           <w:rFonts w:ascii="Arial" w:hAnsi="Arial"/>
           <w:b w:val="0"/>
           <w:color w:val="000000"/>
-          <w:sz w:val="19"/>
+          <w:sz w:val="20"/>
         </w:rPr>
         <w:t xml:space="preserve">• </w:t>
       </w:r>
@@ -267,7 +247,7 @@
           <w:rFonts w:ascii="Arial" w:hAnsi="Arial"/>
           <w:b w:val="0"/>
           <w:color w:val="000000"/>
-          <w:sz w:val="19"/>
+          <w:sz w:val="20"/>
         </w:rPr>
         <w:t>Created an internal web app for monthly IAM audit reporting through AI-assisted development. It replaced a paid commercial workflow and cut the cycle from roughly three to four days to a few hours; the four-member project team now uses it.</w:t>
       </w:r>
@@ -281,7 +261,7 @@
           <w:rFonts w:ascii="Arial" w:hAnsi="Arial"/>
           <w:b w:val="0"/>
           <w:color w:val="000000"/>
-          <w:sz w:val="19"/>
+          <w:sz w:val="20"/>
         </w:rPr>
         <w:t xml:space="preserve">• </w:t>
       </w:r>
@@ -290,7 +270,7 @@
           <w:rFonts w:ascii="Arial" w:hAnsi="Arial"/>
           <w:b w:val="0"/>
           <w:color w:val="000000"/>
-          <w:sz w:val="19"/>
+          <w:sz w:val="20"/>
         </w:rPr>
         <w:t>Turned the employee-transfer SOP into a rule-based tool that cleans SailPoint IdentityIQ exports, formats the manager Excel report, and drafts the email. Case preparation dropped from about 45 minutes to five minutes.</w:t>
       </w:r>
@@ -304,7 +284,7 @@
           <w:rFonts w:ascii="Arial" w:hAnsi="Arial"/>
           <w:b w:val="0"/>
           <w:color w:val="000000"/>
-          <w:sz w:val="19"/>
+          <w:sz w:val="20"/>
         </w:rPr>
         <w:t xml:space="preserve">• </w:t>
       </w:r>
@@ -313,7 +293,7 @@
           <w:rFonts w:ascii="Arial" w:hAnsi="Arial"/>
           <w:b w:val="0"/>
           <w:color w:val="000000"/>
-          <w:sz w:val="19"/>
+          <w:sz w:val="20"/>
         </w:rPr>
         <w:t>Wrote a web-based PowerShell command generator for bulk shared-mailbox permissions, including Full Access, Send As, and Send on Behalf, so analysts can prepare one Exchange Management Shell script instead of handling users one by one.</w:t>
       </w:r>
@@ -327,7 +307,7 @@
           <w:rFonts w:ascii="Arial" w:hAnsi="Arial"/>
           <w:b w:val="0"/>
           <w:color w:val="000000"/>
-          <w:sz w:val="19"/>
+          <w:sz w:val="20"/>
         </w:rPr>
         <w:t xml:space="preserve">• </w:t>
       </w:r>
@@ -336,9 +316,9 @@
           <w:rFonts w:ascii="Arial" w:hAnsi="Arial"/>
           <w:b w:val="0"/>
           <w:color w:val="000000"/>
-          <w:sz w:val="19"/>
+          <w:sz w:val="20"/>
         </w:rPr>
-        <w:t>Review SailPoint entitlements for employee transfers, coordinate decisions with current and future managers, and raise ServiceNow requests when access should be removed.</w:t>
+        <w:t>Support Active Directory groups and password administration, Okta password resets, Microsoft 365 licensing, and shared-mailbox and distribution-list requests through ServiceNow.</w:t>
       </w:r>
     </w:p>
     <w:p>
@@ -350,7 +330,7 @@
           <w:rFonts w:ascii="Arial" w:hAnsi="Arial"/>
           <w:b w:val="0"/>
           <w:color w:val="000000"/>
-          <w:sz w:val="19"/>
+          <w:sz w:val="20"/>
         </w:rPr>
         <w:t xml:space="preserve">• </w:t>
       </w:r>
@@ -359,7 +339,7 @@
           <w:rFonts w:ascii="Arial" w:hAnsi="Arial"/>
           <w:b w:val="0"/>
           <w:color w:val="000000"/>
-          <w:sz w:val="19"/>
+          <w:sz w:val="20"/>
         </w:rPr>
         <w:t>Track Claroty alerts, vulnerabilities, asset and service availability, lost connectivity, and degraded traffic, then document and route findings through email, Microsoft Teams, and Planner.</w:t>
       </w:r>
@@ -396,7 +376,7 @@
           <w:rFonts w:ascii="Arial" w:hAnsi="Arial"/>
           <w:b w:val="0"/>
           <w:color w:val="000000"/>
-          <w:sz w:val="19"/>
+          <w:sz w:val="20"/>
         </w:rPr>
         <w:t xml:space="preserve">• </w:t>
       </w:r>
@@ -405,7 +385,7 @@
           <w:rFonts w:ascii="Arial" w:hAnsi="Arial"/>
           <w:b w:val="0"/>
           <w:color w:val="000000"/>
-          <w:sz w:val="19"/>
+          <w:sz w:val="20"/>
         </w:rPr>
         <w:t>Handled identity lifecycle tasks for employee transfers and terminations, including entitlement review, manager validation, and access-removal coordination.</w:t>
       </w:r>
@@ -419,7 +399,7 @@
           <w:rFonts w:ascii="Arial" w:hAnsi="Arial"/>
           <w:b w:val="0"/>
           <w:color w:val="000000"/>
-          <w:sz w:val="19"/>
+          <w:sz w:val="20"/>
         </w:rPr>
         <w:t xml:space="preserve">• </w:t>
       </w:r>
@@ -428,9 +408,9 @@
           <w:rFonts w:ascii="Arial" w:hAnsi="Arial"/>
           <w:b w:val="0"/>
           <w:color w:val="000000"/>
-          <w:sz w:val="19"/>
+          <w:sz w:val="20"/>
         </w:rPr>
-        <w:t>Coordinated ownership changes for distribution lists, security groups, and service accounts when an employee departure left an ownership gap.</w:t>
+        <w:t>Reviewed SailPoint entitlements for employee transfers, coordinated decisions with current and future managers, and raised ServiceNow requests when access had to be removed.</w:t>
       </w:r>
     </w:p>
     <w:p>
@@ -442,7 +422,7 @@
           <w:rFonts w:ascii="Arial" w:hAnsi="Arial"/>
           <w:b w:val="0"/>
           <w:color w:val="000000"/>
-          <w:sz w:val="19"/>
+          <w:sz w:val="20"/>
         </w:rPr>
         <w:t xml:space="preserve">• </w:t>
       </w:r>
@@ -451,9 +431,9 @@
           <w:rFonts w:ascii="Arial" w:hAnsi="Arial"/>
           <w:b w:val="0"/>
           <w:color w:val="000000"/>
-          <w:sz w:val="19"/>
+          <w:sz w:val="20"/>
         </w:rPr>
-        <w:t>Supported Active Directory groups and password administration, Okta password resets, Microsoft 365 licensing, and shared-mailbox and distribution-list requests through ServiceNow.</w:t>
+        <w:t>Coordinated ownership changes for distribution lists, security groups, and service accounts when an employee departure left an ownership gap.</w:t>
       </w:r>
     </w:p>
     <w:p>
@@ -488,7 +468,7 @@
           <w:rFonts w:ascii="Arial" w:hAnsi="Arial"/>
           <w:b w:val="0"/>
           <w:color w:val="000000"/>
-          <w:sz w:val="19"/>
+          <w:sz w:val="20"/>
         </w:rPr>
         <w:t xml:space="preserve">• </w:t>
       </w:r>
@@ -497,7 +477,7 @@
           <w:rFonts w:ascii="Arial" w:hAnsi="Arial"/>
           <w:b w:val="0"/>
           <w:color w:val="000000"/>
-          <w:sz w:val="19"/>
+          <w:sz w:val="20"/>
         </w:rPr>
         <w:t>Completed a six-month SOC-focused internship covering security monitoring, IBM QRadar SIEM fundamentals, and infrastructure security basics.</w:t>
       </w:r>
@@ -511,7 +491,7 @@
           <w:rFonts w:ascii="Arial" w:hAnsi="Arial"/>
           <w:b w:val="0"/>
           <w:color w:val="000000"/>
-          <w:sz w:val="19"/>
+          <w:sz w:val="20"/>
         </w:rPr>
         <w:t xml:space="preserve">• </w:t>
       </w:r>
@@ -520,7 +500,7 @@
           <w:rFonts w:ascii="Arial" w:hAnsi="Arial"/>
           <w:b w:val="0"/>
           <w:color w:val="000000"/>
-          <w:sz w:val="19"/>
+          <w:sz w:val="20"/>
         </w:rPr>
         <w:t>Practiced DMZ design, server setup, and router and switch configuration through lab and training projects.</w:t>
       </w:r>
@@ -534,7 +514,7 @@
           <w:rFonts w:ascii="Arial" w:hAnsi="Arial"/>
           <w:b w:val="0"/>
           <w:color w:val="000000"/>
-          <w:sz w:val="19"/>
+          <w:sz w:val="20"/>
         </w:rPr>
         <w:t xml:space="preserve">• </w:t>
       </w:r>
@@ -543,7 +523,7 @@
           <w:rFonts w:ascii="Arial" w:hAnsi="Arial"/>
           <w:b w:val="0"/>
           <w:color w:val="000000"/>
-          <w:sz w:val="19"/>
+          <w:sz w:val="20"/>
         </w:rPr>
         <w:t>Earned the IBM Certified Analyst - Security QRadar SIEM V7.4.3 credential during the internship.</w:t>
       </w:r>
@@ -560,13 +540,14 @@
     <w:p>
       <w:pPr>
         <w:pStyle w:val="ResumeBullet"/>
+        <w:spacing w:after="80" w:line="264" w:lineRule="auto"/>
       </w:pPr>
       <w:r>
         <w:rPr>
           <w:rFonts w:ascii="Arial" w:hAnsi="Arial"/>
           <w:b w:val="0"/>
           <w:color w:val="000000"/>
-          <w:sz w:val="19"/>
+          <w:sz w:val="23"/>
         </w:rPr>
         <w:t xml:space="preserve">• </w:t>
       </w:r>
@@ -575,7 +556,7 @@
           <w:rFonts w:ascii="Arial" w:hAnsi="Arial"/>
           <w:b w:val="0"/>
           <w:color w:val="000000"/>
-          <w:sz w:val="19"/>
+          <w:sz w:val="23"/>
         </w:rPr>
         <w:t>SailPoint Certified IdentityIQ Associate | SailPoint | Jan 2025</w:t>
       </w:r>
@@ -583,13 +564,14 @@
     <w:p>
       <w:pPr>
         <w:pStyle w:val="ResumeBullet"/>
+        <w:spacing w:after="80" w:line="264" w:lineRule="auto"/>
       </w:pPr>
       <w:r>
         <w:rPr>
           <w:rFonts w:ascii="Arial" w:hAnsi="Arial"/>
           <w:b w:val="0"/>
           <w:color w:val="000000"/>
-          <w:sz w:val="19"/>
+          <w:sz w:val="23"/>
         </w:rPr>
         <w:t xml:space="preserve">• </w:t>
       </w:r>
@@ -598,7 +580,7 @@
           <w:rFonts w:ascii="Arial" w:hAnsi="Arial"/>
           <w:b w:val="0"/>
           <w:color w:val="000000"/>
-          <w:sz w:val="19"/>
+          <w:sz w:val="23"/>
         </w:rPr>
         <w:t>Claroty Cybersecurity Analyst | Claroty | May 2025</w:t>
       </w:r>
@@ -606,13 +588,14 @@
     <w:p>
       <w:pPr>
         <w:pStyle w:val="ResumeBullet"/>
+        <w:spacing w:after="80" w:line="264" w:lineRule="auto"/>
       </w:pPr>
       <w:r>
         <w:rPr>
           <w:rFonts w:ascii="Arial" w:hAnsi="Arial"/>
           <w:b w:val="0"/>
           <w:color w:val="000000"/>
-          <w:sz w:val="19"/>
+          <w:sz w:val="23"/>
         </w:rPr>
         <w:t xml:space="preserve">• </w:t>
       </w:r>
@@ -621,7 +604,7 @@
           <w:rFonts w:ascii="Arial" w:hAnsi="Arial"/>
           <w:b w:val="0"/>
           <w:color w:val="000000"/>
-          <w:sz w:val="19"/>
+          <w:sz w:val="23"/>
         </w:rPr>
         <w:t>Claroty Implementation Engineer - IND (CIE 401) | Claroty | Dec 2025</w:t>
       </w:r>
@@ -629,13 +612,14 @@
     <w:p>
       <w:pPr>
         <w:pStyle w:val="ResumeBullet"/>
+        <w:spacing w:after="80" w:line="264" w:lineRule="auto"/>
       </w:pPr>
       <w:r>
         <w:rPr>
           <w:rFonts w:ascii="Arial" w:hAnsi="Arial"/>
           <w:b w:val="0"/>
           <w:color w:val="000000"/>
-          <w:sz w:val="19"/>
+          <w:sz w:val="23"/>
         </w:rPr>
         <w:t xml:space="preserve">• </w:t>
       </w:r>
@@ -644,7 +628,7 @@
           <w:rFonts w:ascii="Arial" w:hAnsi="Arial"/>
           <w:b w:val="0"/>
           <w:color w:val="000000"/>
-          <w:sz w:val="19"/>
+          <w:sz w:val="23"/>
         </w:rPr>
         <w:t>IBM Certified Analyst - Security QRadar SIEM V7.4.3 | Exam code C9002900 | Aug 2022</w:t>
       </w:r>
@@ -662,12 +646,24 @@
         <w:pStyle w:val="RoleHeader"/>
       </w:pPr>
       <w:r>
+        <w:rPr>
+          <w:rFonts w:ascii="Arial" w:hAnsi="Arial"/>
+          <w:b/>
+          <w:color w:val="000000"/>
+          <w:sz w:val="21"/>
+        </w:rPr>
         <w:t>Bachelor of Engineering in Computer Science | Dhirajlal Gandhi College of Technology</w:t>
       </w:r>
       <w:r>
         <w:tab/>
       </w:r>
       <w:r>
+        <w:rPr>
+          <w:rFonts w:ascii="Arial" w:hAnsi="Arial"/>
+          <w:b/>
+          <w:color w:val="000000"/>
+          <w:sz w:val="21"/>
+        </w:rPr>
         <w:t>2017 - 2021</w:t>
       </w:r>
     </w:p>
@@ -675,8 +671,16 @@
       <w:pPr>
         <w:pStyle w:val="DetailLine"/>
         <w:keepNext/>
+        <w:spacing w:after="100"/>
       </w:pPr>
       <w:r>
+        <w:rPr>
+          <w:rFonts w:ascii="Arial" w:hAnsi="Arial"/>
+          <w:b w:val="0"/>
+          <w:i/>
+          <w:color w:val="444444"/>
+          <w:sz w:val="21"/>
+        </w:rPr>
         <w:t>Salem, Tamil Nadu, India | CGPA 7.27/10</w:t>
       </w:r>
     </w:p>
@@ -685,25 +689,46 @@
         <w:pStyle w:val="Heading1"/>
       </w:pPr>
       <w:r>
-        <w:t>Personal AI and Security Projects</w:t>
+        <w:t>AI-Assisted Security Portfolio Projects</w:t>
+      </w:r>
+    </w:p>
+    <w:p>
+      <w:pPr>
+        <w:spacing w:after="120" w:line="269" w:lineRule="auto"/>
+      </w:pPr>
+      <w:r>
+        <w:rPr>
+          <w:rFonts w:ascii="Arial" w:hAnsi="Arial"/>
+          <w:b w:val="0"/>
+          <w:color w:val="000000"/>
+          <w:sz w:val="22"/>
+        </w:rPr>
+        <w:t>Independent learning projects created with AI coding assistance and fictional data to explore practical IAM and OT security workflows.</w:t>
       </w:r>
     </w:p>
     <w:p>
       <w:pPr>
         <w:pStyle w:val="RoleHeader"/>
+        <w:spacing w:before="160"/>
       </w:pPr>
-      <w:hyperlink r:id="rId12">
+      <w:hyperlink r:id="rId11">
         <w:r>
           <w:rPr>
             <w:color w:val="444444"/>
             <w:u w:val="none"/>
             <w:rFonts w:ascii="Arial" w:hAnsi="Arial"/>
-            <w:sz w:val="19"/>
+            <w:sz w:val="23"/>
           </w:rPr>
-          <w:t>AccessLens Secure IAM Access Review Copilot</w:t>
+          <w:t>AccessLens IAM Access Review Assistant</w:t>
         </w:r>
       </w:hyperlink>
       <w:r>
+        <w:rPr>
+          <w:rFonts w:ascii="Arial" w:hAnsi="Arial"/>
+          <w:b/>
+          <w:color w:val="000000"/>
+          <w:sz w:val="22"/>
+        </w:rPr>
         <w:tab/>
         <w:t>Independent Portfolio Project</w:t>
       </w:r>
@@ -712,21 +737,30 @@
       <w:pPr>
         <w:pStyle w:val="DetailLine"/>
         <w:keepNext/>
+        <w:spacing w:after="80"/>
       </w:pPr>
       <w:r>
-        <w:t>Python | Streamlit | RAG | AI Security | Docker</w:t>
+        <w:rPr>
+          <w:rFonts w:ascii="Arial" w:hAnsi="Arial"/>
+          <w:b w:val="0"/>
+          <w:i/>
+          <w:color w:val="444444"/>
+          <w:sz w:val="22"/>
+        </w:rPr>
+        <w:t>AI-Assisted Development | Python-Based Web Application | IAM Workflow</w:t>
       </w:r>
     </w:p>
     <w:p>
       <w:pPr>
         <w:pStyle w:val="ResumeBullet"/>
+        <w:spacing w:after="100" w:line="269" w:lineRule="auto"/>
       </w:pPr>
       <w:r>
         <w:rPr>
           <w:rFonts w:ascii="Arial" w:hAnsi="Arial"/>
           <w:b w:val="0"/>
           <w:color w:val="000000"/>
-          <w:sz w:val="19"/>
+          <w:sz w:val="22"/>
         </w:rPr>
         <w:t xml:space="preserve">• </w:t>
       </w:r>
@@ -735,21 +769,22 @@
           <w:rFonts w:ascii="Arial" w:hAnsi="Arial"/>
           <w:b w:val="0"/>
           <w:color w:val="000000"/>
-          <w:sz w:val="19"/>
+          <w:sz w:val="22"/>
         </w:rPr>
-        <w:t>Built a portfolio web app using synthetic SailPoint-style data to flag stale, privileged, lifecycle, and segregation-of-duties risks and prepare manager review reports.</w:t>
+        <w:t>Created with AI coding assistance to review fictional SailPoint-style entitlement data, highlight common access risks, and prepare manager reports.</w:t>
       </w:r>
     </w:p>
     <w:p>
       <w:pPr>
         <w:pStyle w:val="ResumeBullet"/>
+        <w:spacing w:after="100" w:line="269" w:lineRule="auto"/>
       </w:pPr>
       <w:r>
         <w:rPr>
           <w:rFonts w:ascii="Arial" w:hAnsi="Arial"/>
           <w:b w:val="0"/>
           <w:color w:val="000000"/>
-          <w:sz w:val="19"/>
+          <w:sz w:val="22"/>
         </w:rPr>
         <w:t xml:space="preserve">• </w:t>
       </w:r>
@@ -758,27 +793,58 @@
           <w:rFonts w:ascii="Arial" w:hAnsi="Arial"/>
           <w:b w:val="0"/>
           <w:color w:val="000000"/>
-          <w:sz w:val="19"/>
+          <w:sz w:val="22"/>
         </w:rPr>
-        <w:t>Added RAG for policy lookup, prompt-injection checks, validated outputs, human review, and 11 automated tests. The prototype has no production connector and cannot change access.</w:t>
+        <w:t>Produces an easy-to-review risk summary while keeping every access decision with a person.</w:t>
+      </w:r>
+    </w:p>
+    <w:p>
+      <w:pPr>
+        <w:pStyle w:val="ResumeBullet"/>
+        <w:spacing w:after="100" w:line="269" w:lineRule="auto"/>
+      </w:pPr>
+      <w:r>
+        <w:rPr>
+          <w:rFonts w:ascii="Arial" w:hAnsi="Arial"/>
+          <w:b w:val="0"/>
+          <w:color w:val="000000"/>
+          <w:sz w:val="22"/>
+        </w:rPr>
+        <w:t xml:space="preserve">• </w:t>
+      </w:r>
+      <w:r>
+        <w:rPr>
+          <w:rFonts w:ascii="Arial" w:hAnsi="Arial"/>
+          <w:b w:val="0"/>
+          <w:color w:val="000000"/>
+          <w:sz w:val="22"/>
+        </w:rPr>
+        <w:t>Validated with 11 automated tests; the prototype uses no employer data and cannot connect to or change production access.</w:t>
       </w:r>
     </w:p>
     <w:p>
       <w:pPr>
         <w:pStyle w:val="RoleHeader"/>
+        <w:spacing w:before="160"/>
       </w:pPr>
-      <w:hyperlink r:id="rId13">
+      <w:hyperlink r:id="rId12">
         <w:r>
           <w:rPr>
             <w:color w:val="444444"/>
             <w:u w:val="none"/>
             <w:rFonts w:ascii="Arial" w:hAnsi="Arial"/>
-            <w:sz w:val="19"/>
+            <w:sz w:val="23"/>
           </w:rPr>
-          <w:t>OT Security Alert Triage Agent</w:t>
+          <w:t>OT Security Alert Triage Assistant</w:t>
         </w:r>
       </w:hyperlink>
       <w:r>
+        <w:rPr>
+          <w:rFonts w:ascii="Arial" w:hAnsi="Arial"/>
+          <w:b/>
+          <w:color w:val="000000"/>
+          <w:sz w:val="22"/>
+        </w:rPr>
         <w:tab/>
         <w:t>Independent Portfolio Project</w:t>
       </w:r>
@@ -787,21 +853,30 @@
       <w:pPr>
         <w:pStyle w:val="DetailLine"/>
         <w:keepNext/>
+        <w:spacing w:after="80"/>
       </w:pPr>
       <w:r>
-        <w:t>Python | Streamlit | RAG | OT Security | Audit Logging</w:t>
+        <w:rPr>
+          <w:rFonts w:ascii="Arial" w:hAnsi="Arial"/>
+          <w:b w:val="0"/>
+          <w:i/>
+          <w:color w:val="444444"/>
+          <w:sz w:val="22"/>
+        </w:rPr>
+        <w:t>AI-Assisted Development | Python-Based Web Application | OT Workflow</w:t>
       </w:r>
     </w:p>
     <w:p>
       <w:pPr>
         <w:pStyle w:val="ResumeBullet"/>
+        <w:spacing w:after="100" w:line="269" w:lineRule="auto"/>
       </w:pPr>
       <w:r>
         <w:rPr>
           <w:rFonts w:ascii="Arial" w:hAnsi="Arial"/>
           <w:b w:val="0"/>
           <w:color w:val="000000"/>
-          <w:sz w:val="19"/>
+          <w:sz w:val="22"/>
         </w:rPr>
         <w:t xml:space="preserve">• </w:t>
       </w:r>
@@ -810,21 +885,22 @@
           <w:rFonts w:ascii="Arial" w:hAnsi="Arial"/>
           <w:b w:val="0"/>
           <w:color w:val="000000"/>
-          <w:sz w:val="19"/>
+          <w:sz w:val="22"/>
         </w:rPr>
-        <w:t>Built a portfolio tool that turns synthetic OT alerts into explainable risk summaries, runbook-backed response plans, and analyst escalation drafts.</w:t>
+        <w:t>Created with AI coding assistance to turn fictional OT alerts into structured risk summaries, response steps, and analyst escalation drafts.</w:t>
       </w:r>
     </w:p>
     <w:p>
       <w:pPr>
         <w:pStyle w:val="ResumeBullet"/>
+        <w:spacing w:after="100" w:line="269" w:lineRule="auto"/>
       </w:pPr>
       <w:r>
         <w:rPr>
           <w:rFonts w:ascii="Arial" w:hAnsi="Arial"/>
           <w:b w:val="0"/>
           <w:color w:val="000000"/>
-          <w:sz w:val="19"/>
+          <w:sz w:val="22"/>
         </w:rPr>
         <w:t xml:space="preserve">• </w:t>
       </w:r>
@@ -833,9 +909,33 @@
           <w:rFonts w:ascii="Arial" w:hAnsi="Arial"/>
           <w:b w:val="0"/>
           <w:color w:val="000000"/>
-          <w:sz w:val="19"/>
+          <w:sz w:val="22"/>
         </w:rPr>
-        <w:t>Added RAG, rule-based scoring, safety filters, audit logging, human approval, and 23 automated tests across five scenarios. The prototype performs no autonomous remediation.</w:t>
+        <w:t>Organizes alert details and recommended next steps so an analyst can review them before escalation.</w:t>
+      </w:r>
+    </w:p>
+    <w:p>
+      <w:pPr>
+        <w:pStyle w:val="ResumeBullet"/>
+        <w:spacing w:after="100" w:line="269" w:lineRule="auto"/>
+      </w:pPr>
+      <w:r>
+        <w:rPr>
+          <w:rFonts w:ascii="Arial" w:hAnsi="Arial"/>
+          <w:b w:val="0"/>
+          <w:color w:val="000000"/>
+          <w:sz w:val="22"/>
+        </w:rPr>
+        <w:t xml:space="preserve">• </w:t>
+      </w:r>
+      <w:r>
+        <w:rPr>
+          <w:rFonts w:ascii="Arial" w:hAnsi="Arial"/>
+          <w:b w:val="0"/>
+          <w:color w:val="000000"/>
+          <w:sz w:val="22"/>
+        </w:rPr>
+        <w:t>Validated with 23 automated tests; the prototype uses no employer data and cannot connect to or act on production systems.</w:t>
       </w:r>
     </w:p>
     <w:sectPr>
@@ -1212,12 +1312,12 @@
     <w:qFormat/>
     <w:rsid w:val="00FC693F"/>
     <w:pPr>
-      <w:spacing w:after="30" w:line="245" w:lineRule="auto"/>
+      <w:spacing w:after="30" w:line="250" w:lineRule="auto"/>
     </w:pPr>
     <w:rPr>
       <w:rFonts w:ascii="Arial" w:hAnsi="Arial"/>
       <w:color w:val="000000"/>
-      <w:sz w:val="20"/>
+      <w:sz w:val="21"/>
     </w:rPr>
   </w:style>
   <w:style w:type="paragraph" w:styleId="Header">
@@ -1283,7 +1383,7 @@
       <w:b/>
       <w:bCs/>
       <w:color w:val="000000"/>
-      <w:sz w:val="23"/>
+      <w:sz w:val="24"/>
       <w:szCs w:val="28"/>
     </w:rPr>
   </w:style>
@@ -1570,7 +1670,7 @@
       <w:color w:val="000000"/>
       <w:spacing w:val="5"/>
       <w:kern w:val="28"/>
-      <w:sz w:val="44"/>
+      <w:sz w:val="48"/>
       <w:szCs w:val="52"/>
     </w:rPr>
   </w:style>
@@ -12913,7 +13013,7 @@
       <w:rFonts w:ascii="Arial" w:hAnsi="Arial"/>
       <w:b/>
       <w:color w:val="000000"/>
-      <w:sz w:val="20"/>
+      <w:sz w:val="21"/>
     </w:rPr>
   </w:style>
   <w:style w:type="paragraph" w:customStyle="1" w:styleId="DetailLine">
@@ -12926,19 +13026,19 @@
       <w:rFonts w:ascii="Arial" w:hAnsi="Arial"/>
       <w:i/>
       <w:color w:val="444444"/>
-      <w:sz w:val="19"/>
+      <w:sz w:val="20"/>
     </w:rPr>
   </w:style>
   <w:style w:type="paragraph" w:customStyle="1" w:styleId="ResumeBullet">
     <w:name w:val="Resume Bullet"/>
     <w:pPr>
-      <w:spacing w:after="32" w:line="240" w:lineRule="auto"/>
+      <w:spacing w:after="38" w:line="247" w:lineRule="auto"/>
       <w:ind w:left="259" w:hanging="230"/>
     </w:pPr>
     <w:rPr>
       <w:rFonts w:ascii="Arial" w:hAnsi="Arial"/>
       <w:color w:val="000000"/>
-      <w:sz w:val="19"/>
+      <w:sz w:val="20"/>
     </w:rPr>
   </w:style>
 </w:styles>

</xml_diff>

<commit_message>
Balance resume typography across two pages
</commit_message>
<xml_diff>
--- a/assets/Rahul_Raj_Resume.docx
+++ b/assets/Rahul_Raj_Resume.docx
@@ -112,7 +112,7 @@
           <w:rFonts w:ascii="Arial" w:hAnsi="Arial"/>
           <w:b/>
           <w:color w:val="000000"/>
-          <w:sz w:val="20"/>
+          <w:sz w:val="21"/>
         </w:rPr>
         <w:t xml:space="preserve">Identity and Access Management: </w:t>
       </w:r>
@@ -121,7 +121,7 @@
           <w:rFonts w:ascii="Arial" w:hAnsi="Arial"/>
           <w:b w:val="0"/>
           <w:color w:val="000000"/>
-          <w:sz w:val="20"/>
+          <w:sz w:val="21"/>
         </w:rPr>
         <w:t>SailPoint IdentityIQ, identity lifecycle operations, joiner-mover-leaver workflows, entitlement reviews, access governance, Active Directory, Okta, ServiceNow, distribution lists, security groups, and service accounts</w:t>
       </w:r>
@@ -136,7 +136,7 @@
           <w:rFonts w:ascii="Arial" w:hAnsi="Arial"/>
           <w:b/>
           <w:color w:val="000000"/>
-          <w:sz w:val="20"/>
+          <w:sz w:val="21"/>
         </w:rPr>
         <w:t xml:space="preserve">OT and Security Operations: </w:t>
       </w:r>
@@ -145,7 +145,7 @@
           <w:rFonts w:ascii="Arial" w:hAnsi="Arial"/>
           <w:b w:val="0"/>
           <w:color w:val="000000"/>
-          <w:sz w:val="20"/>
+          <w:sz w:val="21"/>
         </w:rPr>
         <w:t>Claroty monitoring, vulnerability and alert triage, asset and service availability, connectivity monitoring, degraded network traffic analysis, escalation, and IBM QRadar SIEM</w:t>
       </w:r>
@@ -160,7 +160,7 @@
           <w:rFonts w:ascii="Arial" w:hAnsi="Arial"/>
           <w:b/>
           <w:color w:val="000000"/>
-          <w:sz w:val="20"/>
+          <w:sz w:val="21"/>
         </w:rPr>
         <w:t xml:space="preserve">Automation and Administration: </w:t>
       </w:r>
@@ -169,7 +169,7 @@
           <w:rFonts w:ascii="Arial" w:hAnsi="Arial"/>
           <w:b w:val="0"/>
           <w:color w:val="000000"/>
-          <w:sz w:val="20"/>
+          <w:sz w:val="21"/>
         </w:rPr>
         <w:t>PowerShell, Microsoft 365, Exchange Online, on-premises Exchange, Excel reporting, ServiceNow, Git, Linux, and VS Code</w:t>
       </w:r>
@@ -184,7 +184,7 @@
           <w:rFonts w:ascii="Arial" w:hAnsi="Arial"/>
           <w:b/>
           <w:color w:val="000000"/>
-          <w:sz w:val="20"/>
+          <w:sz w:val="21"/>
         </w:rPr>
         <w:t xml:space="preserve">AI-Assisted Development: </w:t>
       </w:r>
@@ -193,7 +193,7 @@
           <w:rFonts w:ascii="Arial" w:hAnsi="Arial"/>
           <w:b w:val="0"/>
           <w:color w:val="000000"/>
-          <w:sz w:val="20"/>
+          <w:sz w:val="21"/>
         </w:rPr>
         <w:t>Codex, Claude Code, Python-based web application prototyping, prompt-led development, output review, functional testing, documentation, and human approval</w:t>
       </w:r>
@@ -238,7 +238,7 @@
           <w:rFonts w:ascii="Arial" w:hAnsi="Arial"/>
           <w:b w:val="0"/>
           <w:color w:val="000000"/>
-          <w:sz w:val="20"/>
+          <w:sz w:val="21"/>
         </w:rPr>
         <w:t xml:space="preserve">• </w:t>
       </w:r>
@@ -247,7 +247,7 @@
           <w:rFonts w:ascii="Arial" w:hAnsi="Arial"/>
           <w:b w:val="0"/>
           <w:color w:val="000000"/>
-          <w:sz w:val="20"/>
+          <w:sz w:val="21"/>
         </w:rPr>
         <w:t>Created an internal web app for monthly IAM audit reporting through AI-assisted development. It replaced a paid commercial workflow and cut the cycle from roughly three to four days to a few hours; the four-member project team now uses it.</w:t>
       </w:r>
@@ -261,7 +261,7 @@
           <w:rFonts w:ascii="Arial" w:hAnsi="Arial"/>
           <w:b w:val="0"/>
           <w:color w:val="000000"/>
-          <w:sz w:val="20"/>
+          <w:sz w:val="21"/>
         </w:rPr>
         <w:t xml:space="preserve">• </w:t>
       </w:r>
@@ -270,7 +270,7 @@
           <w:rFonts w:ascii="Arial" w:hAnsi="Arial"/>
           <w:b w:val="0"/>
           <w:color w:val="000000"/>
-          <w:sz w:val="20"/>
+          <w:sz w:val="21"/>
         </w:rPr>
         <w:t>Turned the employee-transfer SOP into a rule-based tool that cleans SailPoint IdentityIQ exports, formats the manager Excel report, and drafts the email. Case preparation dropped from about 45 minutes to five minutes.</w:t>
       </w:r>
@@ -284,7 +284,7 @@
           <w:rFonts w:ascii="Arial" w:hAnsi="Arial"/>
           <w:b w:val="0"/>
           <w:color w:val="000000"/>
-          <w:sz w:val="20"/>
+          <w:sz w:val="21"/>
         </w:rPr>
         <w:t xml:space="preserve">• </w:t>
       </w:r>
@@ -293,7 +293,7 @@
           <w:rFonts w:ascii="Arial" w:hAnsi="Arial"/>
           <w:b w:val="0"/>
           <w:color w:val="000000"/>
-          <w:sz w:val="20"/>
+          <w:sz w:val="21"/>
         </w:rPr>
         <w:t>Wrote a web-based PowerShell command generator for bulk shared-mailbox permissions, including Full Access, Send As, and Send on Behalf, so analysts can prepare one Exchange Management Shell script instead of handling users one by one.</w:t>
       </w:r>
@@ -307,7 +307,7 @@
           <w:rFonts w:ascii="Arial" w:hAnsi="Arial"/>
           <w:b w:val="0"/>
           <w:color w:val="000000"/>
-          <w:sz w:val="20"/>
+          <w:sz w:val="21"/>
         </w:rPr>
         <w:t xml:space="preserve">• </w:t>
       </w:r>
@@ -316,7 +316,7 @@
           <w:rFonts w:ascii="Arial" w:hAnsi="Arial"/>
           <w:b w:val="0"/>
           <w:color w:val="000000"/>
-          <w:sz w:val="20"/>
+          <w:sz w:val="21"/>
         </w:rPr>
         <w:t>Support Active Directory groups and password administration, Okta password resets, Microsoft 365 licensing, and shared-mailbox and distribution-list requests through ServiceNow.</w:t>
       </w:r>
@@ -330,7 +330,7 @@
           <w:rFonts w:ascii="Arial" w:hAnsi="Arial"/>
           <w:b w:val="0"/>
           <w:color w:val="000000"/>
-          <w:sz w:val="20"/>
+          <w:sz w:val="21"/>
         </w:rPr>
         <w:t xml:space="preserve">• </w:t>
       </w:r>
@@ -339,7 +339,7 @@
           <w:rFonts w:ascii="Arial" w:hAnsi="Arial"/>
           <w:b w:val="0"/>
           <w:color w:val="000000"/>
-          <w:sz w:val="20"/>
+          <w:sz w:val="21"/>
         </w:rPr>
         <w:t>Track Claroty alerts, vulnerabilities, asset and service availability, lost connectivity, and degraded traffic, then document and route findings through email, Microsoft Teams, and Planner.</w:t>
       </w:r>
@@ -376,7 +376,7 @@
           <w:rFonts w:ascii="Arial" w:hAnsi="Arial"/>
           <w:b w:val="0"/>
           <w:color w:val="000000"/>
-          <w:sz w:val="20"/>
+          <w:sz w:val="21"/>
         </w:rPr>
         <w:t xml:space="preserve">• </w:t>
       </w:r>
@@ -385,7 +385,7 @@
           <w:rFonts w:ascii="Arial" w:hAnsi="Arial"/>
           <w:b w:val="0"/>
           <w:color w:val="000000"/>
-          <w:sz w:val="20"/>
+          <w:sz w:val="21"/>
         </w:rPr>
         <w:t>Handled identity lifecycle tasks for employee transfers and terminations, including entitlement review, manager validation, and access-removal coordination.</w:t>
       </w:r>
@@ -399,7 +399,7 @@
           <w:rFonts w:ascii="Arial" w:hAnsi="Arial"/>
           <w:b w:val="0"/>
           <w:color w:val="000000"/>
-          <w:sz w:val="20"/>
+          <w:sz w:val="21"/>
         </w:rPr>
         <w:t xml:space="preserve">• </w:t>
       </w:r>
@@ -408,7 +408,7 @@
           <w:rFonts w:ascii="Arial" w:hAnsi="Arial"/>
           <w:b w:val="0"/>
           <w:color w:val="000000"/>
-          <w:sz w:val="20"/>
+          <w:sz w:val="21"/>
         </w:rPr>
         <w:t>Reviewed SailPoint entitlements for employee transfers, coordinated decisions with current and future managers, and raised ServiceNow requests when access had to be removed.</w:t>
       </w:r>
@@ -422,7 +422,7 @@
           <w:rFonts w:ascii="Arial" w:hAnsi="Arial"/>
           <w:b w:val="0"/>
           <w:color w:val="000000"/>
-          <w:sz w:val="20"/>
+          <w:sz w:val="21"/>
         </w:rPr>
         <w:t xml:space="preserve">• </w:t>
       </w:r>
@@ -431,9 +431,18 @@
           <w:rFonts w:ascii="Arial" w:hAnsi="Arial"/>
           <w:b w:val="0"/>
           <w:color w:val="000000"/>
-          <w:sz w:val="20"/>
+          <w:sz w:val="21"/>
         </w:rPr>
         <w:t>Coordinated ownership changes for distribution lists, security groups, and service accounts when an employee departure left an ownership gap.</w:t>
+      </w:r>
+    </w:p>
+    <w:p>
+      <w:pPr>
+        <w:pStyle w:val="Heading1"/>
+        <w:pageBreakBefore/>
+      </w:pPr>
+      <w:r>
+        <w:t>Professional Experience (continued)</w:t>
       </w:r>
     </w:p>
     <w:p>
@@ -468,7 +477,7 @@
           <w:rFonts w:ascii="Arial" w:hAnsi="Arial"/>
           <w:b w:val="0"/>
           <w:color w:val="000000"/>
-          <w:sz w:val="20"/>
+          <w:sz w:val="21"/>
         </w:rPr>
         <w:t xml:space="preserve">• </w:t>
       </w:r>
@@ -477,7 +486,7 @@
           <w:rFonts w:ascii="Arial" w:hAnsi="Arial"/>
           <w:b w:val="0"/>
           <w:color w:val="000000"/>
-          <w:sz w:val="20"/>
+          <w:sz w:val="21"/>
         </w:rPr>
         <w:t>Completed a six-month SOC-focused internship covering security monitoring, IBM QRadar SIEM fundamentals, and infrastructure security basics.</w:t>
       </w:r>
@@ -491,7 +500,7 @@
           <w:rFonts w:ascii="Arial" w:hAnsi="Arial"/>
           <w:b w:val="0"/>
           <w:color w:val="000000"/>
-          <w:sz w:val="20"/>
+          <w:sz w:val="21"/>
         </w:rPr>
         <w:t xml:space="preserve">• </w:t>
       </w:r>
@@ -500,7 +509,7 @@
           <w:rFonts w:ascii="Arial" w:hAnsi="Arial"/>
           <w:b w:val="0"/>
           <w:color w:val="000000"/>
-          <w:sz w:val="20"/>
+          <w:sz w:val="21"/>
         </w:rPr>
         <w:t>Practiced DMZ design, server setup, and router and switch configuration through lab and training projects.</w:t>
       </w:r>
@@ -514,7 +523,7 @@
           <w:rFonts w:ascii="Arial" w:hAnsi="Arial"/>
           <w:b w:val="0"/>
           <w:color w:val="000000"/>
-          <w:sz w:val="20"/>
+          <w:sz w:val="21"/>
         </w:rPr>
         <w:t xml:space="preserve">• </w:t>
       </w:r>
@@ -523,7 +532,7 @@
           <w:rFonts w:ascii="Arial" w:hAnsi="Arial"/>
           <w:b w:val="0"/>
           <w:color w:val="000000"/>
-          <w:sz w:val="20"/>
+          <w:sz w:val="21"/>
         </w:rPr>
         <w:t>Earned the IBM Certified Analyst - Security QRadar SIEM V7.4.3 credential during the internship.</w:t>
       </w:r>
@@ -531,7 +540,6 @@
     <w:p>
       <w:pPr>
         <w:pStyle w:val="Heading1"/>
-        <w:pageBreakBefore/>
       </w:pPr>
       <w:r>
         <w:t>Certifications</w:t>
@@ -540,14 +548,14 @@
     <w:p>
       <w:pPr>
         <w:pStyle w:val="ResumeBullet"/>
-        <w:spacing w:after="80" w:line="264" w:lineRule="auto"/>
+        <w:spacing w:after="40" w:line="250" w:lineRule="auto"/>
       </w:pPr>
       <w:r>
         <w:rPr>
           <w:rFonts w:ascii="Arial" w:hAnsi="Arial"/>
           <w:b w:val="0"/>
           <w:color w:val="000000"/>
-          <w:sz w:val="23"/>
+          <w:sz w:val="21"/>
         </w:rPr>
         <w:t xml:space="preserve">• </w:t>
       </w:r>
@@ -556,7 +564,7 @@
           <w:rFonts w:ascii="Arial" w:hAnsi="Arial"/>
           <w:b w:val="0"/>
           <w:color w:val="000000"/>
-          <w:sz w:val="23"/>
+          <w:sz w:val="21"/>
         </w:rPr>
         <w:t>SailPoint Certified IdentityIQ Associate | SailPoint | Jan 2025</w:t>
       </w:r>
@@ -564,14 +572,14 @@
     <w:p>
       <w:pPr>
         <w:pStyle w:val="ResumeBullet"/>
-        <w:spacing w:after="80" w:line="264" w:lineRule="auto"/>
+        <w:spacing w:after="40" w:line="250" w:lineRule="auto"/>
       </w:pPr>
       <w:r>
         <w:rPr>
           <w:rFonts w:ascii="Arial" w:hAnsi="Arial"/>
           <w:b w:val="0"/>
           <w:color w:val="000000"/>
-          <w:sz w:val="23"/>
+          <w:sz w:val="21"/>
         </w:rPr>
         <w:t xml:space="preserve">• </w:t>
       </w:r>
@@ -580,7 +588,7 @@
           <w:rFonts w:ascii="Arial" w:hAnsi="Arial"/>
           <w:b w:val="0"/>
           <w:color w:val="000000"/>
-          <w:sz w:val="23"/>
+          <w:sz w:val="21"/>
         </w:rPr>
         <w:t>Claroty Cybersecurity Analyst | Claroty | May 2025</w:t>
       </w:r>
@@ -588,14 +596,14 @@
     <w:p>
       <w:pPr>
         <w:pStyle w:val="ResumeBullet"/>
-        <w:spacing w:after="80" w:line="264" w:lineRule="auto"/>
+        <w:spacing w:after="40" w:line="250" w:lineRule="auto"/>
       </w:pPr>
       <w:r>
         <w:rPr>
           <w:rFonts w:ascii="Arial" w:hAnsi="Arial"/>
           <w:b w:val="0"/>
           <w:color w:val="000000"/>
-          <w:sz w:val="23"/>
+          <w:sz w:val="21"/>
         </w:rPr>
         <w:t xml:space="preserve">• </w:t>
       </w:r>
@@ -604,7 +612,7 @@
           <w:rFonts w:ascii="Arial" w:hAnsi="Arial"/>
           <w:b w:val="0"/>
           <w:color w:val="000000"/>
-          <w:sz w:val="23"/>
+          <w:sz w:val="21"/>
         </w:rPr>
         <w:t>Claroty Implementation Engineer - IND (CIE 401) | Claroty | Dec 2025</w:t>
       </w:r>
@@ -612,14 +620,14 @@
     <w:p>
       <w:pPr>
         <w:pStyle w:val="ResumeBullet"/>
-        <w:spacing w:after="80" w:line="264" w:lineRule="auto"/>
+        <w:spacing w:after="40" w:line="250" w:lineRule="auto"/>
       </w:pPr>
       <w:r>
         <w:rPr>
           <w:rFonts w:ascii="Arial" w:hAnsi="Arial"/>
           <w:b w:val="0"/>
           <w:color w:val="000000"/>
-          <w:sz w:val="23"/>
+          <w:sz w:val="21"/>
         </w:rPr>
         <w:t xml:space="preserve">• </w:t>
       </w:r>
@@ -628,7 +636,7 @@
           <w:rFonts w:ascii="Arial" w:hAnsi="Arial"/>
           <w:b w:val="0"/>
           <w:color w:val="000000"/>
-          <w:sz w:val="23"/>
+          <w:sz w:val="21"/>
         </w:rPr>
         <w:t>IBM Certified Analyst - Security QRadar SIEM V7.4.3 | Exam code C9002900 | Aug 2022</w:t>
       </w:r>
@@ -679,7 +687,7 @@
           <w:b w:val="0"/>
           <w:i/>
           <w:color w:val="444444"/>
-          <w:sz w:val="21"/>
+          <w:sz w:val="20"/>
         </w:rPr>
         <w:t>Salem, Tamil Nadu, India | CGPA 7.27/10</w:t>
       </w:r>
@@ -694,14 +702,14 @@
     </w:p>
     <w:p>
       <w:pPr>
-        <w:spacing w:after="120" w:line="269" w:lineRule="auto"/>
+        <w:spacing w:after="60" w:line="250" w:lineRule="auto"/>
       </w:pPr>
       <w:r>
         <w:rPr>
           <w:rFonts w:ascii="Arial" w:hAnsi="Arial"/>
           <w:b w:val="0"/>
           <w:color w:val="000000"/>
-          <w:sz w:val="22"/>
+          <w:sz w:val="21"/>
         </w:rPr>
         <w:t>Independent learning projects created with AI coding assistance and fictional data to explore practical IAM and OT security workflows.</w:t>
       </w:r>
@@ -709,7 +717,7 @@
     <w:p>
       <w:pPr>
         <w:pStyle w:val="RoleHeader"/>
-        <w:spacing w:before="160"/>
+        <w:spacing w:before="100"/>
       </w:pPr>
       <w:hyperlink r:id="rId11">
         <w:r>
@@ -717,7 +725,7 @@
             <w:color w:val="444444"/>
             <w:u w:val="none"/>
             <w:rFonts w:ascii="Arial" w:hAnsi="Arial"/>
-            <w:sz w:val="23"/>
+            <w:sz w:val="22"/>
           </w:rPr>
           <w:t>AccessLens IAM Access Review Assistant</w:t>
         </w:r>
@@ -727,7 +735,7 @@
           <w:rFonts w:ascii="Arial" w:hAnsi="Arial"/>
           <w:b/>
           <w:color w:val="000000"/>
-          <w:sz w:val="22"/>
+          <w:sz w:val="21"/>
         </w:rPr>
         <w:tab/>
         <w:t>Independent Portfolio Project</w:t>
@@ -737,7 +745,7 @@
       <w:pPr>
         <w:pStyle w:val="DetailLine"/>
         <w:keepNext/>
-        <w:spacing w:after="80"/>
+        <w:spacing w:after="40"/>
       </w:pPr>
       <w:r>
         <w:rPr>
@@ -745,7 +753,7 @@
           <w:b w:val="0"/>
           <w:i/>
           <w:color w:val="444444"/>
-          <w:sz w:val="22"/>
+          <w:sz w:val="20"/>
         </w:rPr>
         <w:t>AI-Assisted Development | Python-Based Web Application | IAM Workflow</w:t>
       </w:r>
@@ -753,14 +761,14 @@
     <w:p>
       <w:pPr>
         <w:pStyle w:val="ResumeBullet"/>
-        <w:spacing w:after="100" w:line="269" w:lineRule="auto"/>
+        <w:spacing w:after="50" w:line="252" w:lineRule="auto"/>
       </w:pPr>
       <w:r>
         <w:rPr>
           <w:rFonts w:ascii="Arial" w:hAnsi="Arial"/>
           <w:b w:val="0"/>
           <w:color w:val="000000"/>
-          <w:sz w:val="22"/>
+          <w:sz w:val="21"/>
         </w:rPr>
         <w:t xml:space="preserve">• </w:t>
       </w:r>
@@ -769,7 +777,7 @@
           <w:rFonts w:ascii="Arial" w:hAnsi="Arial"/>
           <w:b w:val="0"/>
           <w:color w:val="000000"/>
-          <w:sz w:val="22"/>
+          <w:sz w:val="21"/>
         </w:rPr>
         <w:t>Created with AI coding assistance to review fictional SailPoint-style entitlement data, highlight common access risks, and prepare manager reports.</w:t>
       </w:r>
@@ -777,14 +785,14 @@
     <w:p>
       <w:pPr>
         <w:pStyle w:val="ResumeBullet"/>
-        <w:spacing w:after="100" w:line="269" w:lineRule="auto"/>
+        <w:spacing w:after="50" w:line="252" w:lineRule="auto"/>
       </w:pPr>
       <w:r>
         <w:rPr>
           <w:rFonts w:ascii="Arial" w:hAnsi="Arial"/>
           <w:b w:val="0"/>
           <w:color w:val="000000"/>
-          <w:sz w:val="22"/>
+          <w:sz w:val="21"/>
         </w:rPr>
         <w:t xml:space="preserve">• </w:t>
       </w:r>
@@ -793,7 +801,7 @@
           <w:rFonts w:ascii="Arial" w:hAnsi="Arial"/>
           <w:b w:val="0"/>
           <w:color w:val="000000"/>
-          <w:sz w:val="22"/>
+          <w:sz w:val="21"/>
         </w:rPr>
         <w:t>Produces an easy-to-review risk summary while keeping every access decision with a person.</w:t>
       </w:r>
@@ -801,14 +809,14 @@
     <w:p>
       <w:pPr>
         <w:pStyle w:val="ResumeBullet"/>
-        <w:spacing w:after="100" w:line="269" w:lineRule="auto"/>
+        <w:spacing w:after="50" w:line="252" w:lineRule="auto"/>
       </w:pPr>
       <w:r>
         <w:rPr>
           <w:rFonts w:ascii="Arial" w:hAnsi="Arial"/>
           <w:b w:val="0"/>
           <w:color w:val="000000"/>
-          <w:sz w:val="22"/>
+          <w:sz w:val="21"/>
         </w:rPr>
         <w:t xml:space="preserve">• </w:t>
       </w:r>
@@ -817,7 +825,7 @@
           <w:rFonts w:ascii="Arial" w:hAnsi="Arial"/>
           <w:b w:val="0"/>
           <w:color w:val="000000"/>
-          <w:sz w:val="22"/>
+          <w:sz w:val="21"/>
         </w:rPr>
         <w:t>Validated with 11 automated tests; the prototype uses no employer data and cannot connect to or change production access.</w:t>
       </w:r>
@@ -825,7 +833,7 @@
     <w:p>
       <w:pPr>
         <w:pStyle w:val="RoleHeader"/>
-        <w:spacing w:before="160"/>
+        <w:spacing w:before="100"/>
       </w:pPr>
       <w:hyperlink r:id="rId12">
         <w:r>
@@ -833,7 +841,7 @@
             <w:color w:val="444444"/>
             <w:u w:val="none"/>
             <w:rFonts w:ascii="Arial" w:hAnsi="Arial"/>
-            <w:sz w:val="23"/>
+            <w:sz w:val="22"/>
           </w:rPr>
           <w:t>OT Security Alert Triage Assistant</w:t>
         </w:r>
@@ -843,7 +851,7 @@
           <w:rFonts w:ascii="Arial" w:hAnsi="Arial"/>
           <w:b/>
           <w:color w:val="000000"/>
-          <w:sz w:val="22"/>
+          <w:sz w:val="21"/>
         </w:rPr>
         <w:tab/>
         <w:t>Independent Portfolio Project</w:t>
@@ -853,7 +861,7 @@
       <w:pPr>
         <w:pStyle w:val="DetailLine"/>
         <w:keepNext/>
-        <w:spacing w:after="80"/>
+        <w:spacing w:after="40"/>
       </w:pPr>
       <w:r>
         <w:rPr>
@@ -861,7 +869,7 @@
           <w:b w:val="0"/>
           <w:i/>
           <w:color w:val="444444"/>
-          <w:sz w:val="22"/>
+          <w:sz w:val="20"/>
         </w:rPr>
         <w:t>AI-Assisted Development | Python-Based Web Application | OT Workflow</w:t>
       </w:r>
@@ -869,14 +877,14 @@
     <w:p>
       <w:pPr>
         <w:pStyle w:val="ResumeBullet"/>
-        <w:spacing w:after="100" w:line="269" w:lineRule="auto"/>
+        <w:spacing w:after="50" w:line="252" w:lineRule="auto"/>
       </w:pPr>
       <w:r>
         <w:rPr>
           <w:rFonts w:ascii="Arial" w:hAnsi="Arial"/>
           <w:b w:val="0"/>
           <w:color w:val="000000"/>
-          <w:sz w:val="22"/>
+          <w:sz w:val="21"/>
         </w:rPr>
         <w:t xml:space="preserve">• </w:t>
       </w:r>
@@ -885,7 +893,7 @@
           <w:rFonts w:ascii="Arial" w:hAnsi="Arial"/>
           <w:b w:val="0"/>
           <w:color w:val="000000"/>
-          <w:sz w:val="22"/>
+          <w:sz w:val="21"/>
         </w:rPr>
         <w:t>Created with AI coding assistance to turn fictional OT alerts into structured risk summaries, response steps, and analyst escalation drafts.</w:t>
       </w:r>
@@ -893,14 +901,14 @@
     <w:p>
       <w:pPr>
         <w:pStyle w:val="ResumeBullet"/>
-        <w:spacing w:after="100" w:line="269" w:lineRule="auto"/>
+        <w:spacing w:after="50" w:line="252" w:lineRule="auto"/>
       </w:pPr>
       <w:r>
         <w:rPr>
           <w:rFonts w:ascii="Arial" w:hAnsi="Arial"/>
           <w:b w:val="0"/>
           <w:color w:val="000000"/>
-          <w:sz w:val="22"/>
+          <w:sz w:val="21"/>
         </w:rPr>
         <w:t xml:space="preserve">• </w:t>
       </w:r>
@@ -909,7 +917,7 @@
           <w:rFonts w:ascii="Arial" w:hAnsi="Arial"/>
           <w:b w:val="0"/>
           <w:color w:val="000000"/>
-          <w:sz w:val="22"/>
+          <w:sz w:val="21"/>
         </w:rPr>
         <w:t>Organizes alert details and recommended next steps so an analyst can review them before escalation.</w:t>
       </w:r>
@@ -917,14 +925,14 @@
     <w:p>
       <w:pPr>
         <w:pStyle w:val="ResumeBullet"/>
-        <w:spacing w:after="100" w:line="269" w:lineRule="auto"/>
+        <w:spacing w:after="50" w:line="252" w:lineRule="auto"/>
       </w:pPr>
       <w:r>
         <w:rPr>
           <w:rFonts w:ascii="Arial" w:hAnsi="Arial"/>
           <w:b w:val="0"/>
           <w:color w:val="000000"/>
-          <w:sz w:val="22"/>
+          <w:sz w:val="21"/>
         </w:rPr>
         <w:t xml:space="preserve">• </w:t>
       </w:r>
@@ -933,7 +941,7 @@
           <w:rFonts w:ascii="Arial" w:hAnsi="Arial"/>
           <w:b w:val="0"/>
           <w:color w:val="000000"/>
-          <w:sz w:val="22"/>
+          <w:sz w:val="21"/>
         </w:rPr>
         <w:t>Validated with 23 automated tests; the prototype uses no employer data and cannot connect to or act on production systems.</w:t>
       </w:r>
@@ -13032,13 +13040,13 @@
   <w:style w:type="paragraph" w:customStyle="1" w:styleId="ResumeBullet">
     <w:name w:val="Resume Bullet"/>
     <w:pPr>
-      <w:spacing w:after="38" w:line="247" w:lineRule="auto"/>
+      <w:spacing w:after="40" w:line="250" w:lineRule="auto"/>
       <w:ind w:left="259" w:hanging="230"/>
     </w:pPr>
     <w:rPr>
       <w:rFonts w:ascii="Arial" w:hAnsi="Arial"/>
       <w:color w:val="000000"/>
-      <w:sz w:val="20"/>
+      <w:sz w:val="21"/>
     </w:rPr>
   </w:style>
 </w:styles>

</xml_diff>

<commit_message>
Add working project pages and align credentials
</commit_message>
<xml_diff>
--- a/assets/Rahul_Raj_Resume.docx
+++ b/assets/Rahul_Raj_Resume.docx
@@ -68,7 +68,7 @@
             <w:rFonts w:ascii="Arial" w:hAnsi="Arial"/>
             <w:sz w:val="20"/>
           </w:rPr>
-          <w:t>github.com/vcrahulraj</w:t>
+          <w:t>vcrahulraj.github.io</w:t>
         </w:r>
       </w:hyperlink>
     </w:p>
@@ -547,8 +547,11 @@
     </w:p>
     <w:p>
       <w:pPr>
-        <w:pStyle w:val="ResumeBullet"/>
+        <w:tabs>
+          <w:tab w:pos="10339" w:val="right"/>
+        </w:tabs>
         <w:spacing w:after="40" w:line="250" w:lineRule="auto"/>
+        <w:ind w:left="259" w:hanging="230" w:right="0"/>
       </w:pPr>
       <w:r>
         <w:rPr>
@@ -566,13 +569,28 @@
           <w:color w:val="000000"/>
           <w:sz w:val="21"/>
         </w:rPr>
-        <w:t>SailPoint Certified IdentityIQ Associate | SailPoint | Jan 2025</w:t>
+        <w:t>Claroty Implementation Engineer - IND (CIE 401) | Claroty</w:t>
+      </w:r>
+      <w:r>
+        <w:tab/>
+      </w:r>
+      <w:r>
+        <w:rPr>
+          <w:rFonts w:ascii="Arial" w:hAnsi="Arial"/>
+          <w:b/>
+          <w:color w:val="000000"/>
+          <w:sz w:val="21"/>
+        </w:rPr>
+        <w:t>December 2025</w:t>
       </w:r>
     </w:p>
     <w:p>
       <w:pPr>
-        <w:pStyle w:val="ResumeBullet"/>
+        <w:tabs>
+          <w:tab w:pos="10339" w:val="right"/>
+        </w:tabs>
         <w:spacing w:after="40" w:line="250" w:lineRule="auto"/>
+        <w:ind w:left="259" w:hanging="230" w:right="0"/>
       </w:pPr>
       <w:r>
         <w:rPr>
@@ -590,13 +608,28 @@
           <w:color w:val="000000"/>
           <w:sz w:val="21"/>
         </w:rPr>
-        <w:t>Claroty Cybersecurity Analyst | Claroty | May 2025</w:t>
+        <w:t>Claroty Cybersecurity Analyst | Claroty</w:t>
+      </w:r>
+      <w:r>
+        <w:tab/>
+      </w:r>
+      <w:r>
+        <w:rPr>
+          <w:rFonts w:ascii="Arial" w:hAnsi="Arial"/>
+          <w:b/>
+          <w:color w:val="000000"/>
+          <w:sz w:val="21"/>
+        </w:rPr>
+        <w:t>May 2025</w:t>
       </w:r>
     </w:p>
     <w:p>
       <w:pPr>
-        <w:pStyle w:val="ResumeBullet"/>
+        <w:tabs>
+          <w:tab w:pos="10339" w:val="right"/>
+        </w:tabs>
         <w:spacing w:after="40" w:line="250" w:lineRule="auto"/>
+        <w:ind w:left="259" w:hanging="230" w:right="0"/>
       </w:pPr>
       <w:r>
         <w:rPr>
@@ -614,13 +647,28 @@
           <w:color w:val="000000"/>
           <w:sz w:val="21"/>
         </w:rPr>
-        <w:t>Claroty Implementation Engineer - IND (CIE 401) | Claroty | Dec 2025</w:t>
+        <w:t>SailPoint Certified IdentityIQ Associate | SailPoint</w:t>
+      </w:r>
+      <w:r>
+        <w:tab/>
+      </w:r>
+      <w:r>
+        <w:rPr>
+          <w:rFonts w:ascii="Arial" w:hAnsi="Arial"/>
+          <w:b/>
+          <w:color w:val="000000"/>
+          <w:sz w:val="21"/>
+        </w:rPr>
+        <w:t>January 2025</w:t>
       </w:r>
     </w:p>
     <w:p>
       <w:pPr>
-        <w:pStyle w:val="ResumeBullet"/>
+        <w:tabs>
+          <w:tab w:pos="10339" w:val="right"/>
+        </w:tabs>
         <w:spacing w:after="40" w:line="250" w:lineRule="auto"/>
+        <w:ind w:left="259" w:hanging="230" w:right="0"/>
       </w:pPr>
       <w:r>
         <w:rPr>
@@ -638,7 +686,19 @@
           <w:color w:val="000000"/>
           <w:sz w:val="21"/>
         </w:rPr>
-        <w:t>IBM Certified Analyst - Security QRadar SIEM V7.4.3 | Exam code C9002900 | Aug 2022</w:t>
+        <w:t>IBM Certified Analyst - Security QRadar SIEM V7.4.3 | IBM | Exam code C9002900</w:t>
+      </w:r>
+      <w:r>
+        <w:tab/>
+      </w:r>
+      <w:r>
+        <w:rPr>
+          <w:rFonts w:ascii="Arial" w:hAnsi="Arial"/>
+          <w:b/>
+          <w:color w:val="000000"/>
+          <w:sz w:val="21"/>
+        </w:rPr>
+        <w:t>August 2022</w:t>
       </w:r>
     </w:p>
     <w:p>

</xml_diff>

<commit_message>
Use regular weight for certification dates
</commit_message>
<xml_diff>
--- a/assets/Rahul_Raj_Resume.docx
+++ b/assets/Rahul_Raj_Resume.docx
@@ -577,7 +577,7 @@
       <w:r>
         <w:rPr>
           <w:rFonts w:ascii="Arial" w:hAnsi="Arial"/>
-          <w:b/>
+          <w:b w:val="0"/>
           <w:color w:val="000000"/>
           <w:sz w:val="21"/>
         </w:rPr>
@@ -616,7 +616,7 @@
       <w:r>
         <w:rPr>
           <w:rFonts w:ascii="Arial" w:hAnsi="Arial"/>
-          <w:b/>
+          <w:b w:val="0"/>
           <w:color w:val="000000"/>
           <w:sz w:val="21"/>
         </w:rPr>
@@ -655,7 +655,7 @@
       <w:r>
         <w:rPr>
           <w:rFonts w:ascii="Arial" w:hAnsi="Arial"/>
-          <w:b/>
+          <w:b w:val="0"/>
           <w:color w:val="000000"/>
           <w:sz w:val="21"/>
         </w:rPr>
@@ -694,7 +694,7 @@
       <w:r>
         <w:rPr>
           <w:rFonts w:ascii="Arial" w:hAnsi="Arial"/>
-          <w:b/>
+          <w:b w:val="0"/>
           <w:color w:val="000000"/>
           <w:sz w:val="21"/>
         </w:rPr>

</xml_diff>